<commit_message>
Architectural / structural works inputs with tick boxes (Form 24, change request)
New inputs: architectural drawings and structural drawings works (يوجد أعمال /
لا يوجد أعمال) with a detailed description each. Form 24 ticks the matching box
on the Arabic and English sides and prints the description on its dotted lines;
the change request letter prints the descriptions under التعديل الانشائي and
التعديل المعماري (PDF and Word).

Co-Authored-By: Claude Opus 5.5 <noreply@anthropic.com>
Claude-Session: https://claude.ai/code/session_01KhB95Q3CdNoHoGHNq4XQ7x
</commit_message>
<xml_diff>
--- a/templates/dist/bld-archstr-change-request.docx
+++ b/templates/dist/bld-archstr-change-request.docx
@@ -867,6 +867,28 @@
           <w:rtl/>
           <w:lang w:bidi="ar-AE"/>
         </w:rPr>
+        <w:t> </w:t>
+      </w:r>
+      <w:r>
+        <w:rPr>
+          <w:rFonts w:cs="Times New Roman" w:ascii="Times New Roman" w:hAnsi="Times New Roman" w:eastAsia="Times New Roman"/>
+          <w:rtl/>
+          <w:lang w:bidi="ar-AE"/>
+          <w:color w:val="FFFFFF"/>
+          <w:spacing w:val="-20"/>
+          <w:sz w:val="2"/>
+          <w:szCs w:val="2"/>
+        </w:rPr>
+        <w:t xml:space="preserve">QZ8ZQ</w:t>
+      </w:r>
+      <w:r>
+        <w:rPr>
+          <w:rFonts w:hint="cs"/>
+          <w:sz w:val="32"/>
+          <w:szCs w:val="32"/>
+          <w:rtl/>
+          <w:lang w:bidi="ar-AE"/>
+        </w:rPr>
         <w:t xml:space="preserve"/>
       </w:r>
       <w:r>
@@ -957,6 +979,28 @@
           <w:lang w:bidi="ar-SY"/>
         </w:rPr>
         <w:t xml:space="preserve">‏</w:t>
+      </w:r>
+      <w:r>
+        <w:rPr>
+          <w:rFonts w:hint="cs"/>
+          <w:sz w:val="32"/>
+          <w:szCs w:val="32"/>
+          <w:rtl/>
+          <w:lang w:bidi="ar-SY"/>
+        </w:rPr>
+        <w:t> </w:t>
+      </w:r>
+      <w:r>
+        <w:rPr>
+          <w:rFonts w:cs="Times New Roman" w:ascii="Times New Roman" w:hAnsi="Times New Roman" w:eastAsia="Times New Roman"/>
+          <w:rtl/>
+          <w:lang w:bidi="ar-SY"/>
+          <w:color w:val="FFFFFF"/>
+          <w:spacing w:val="-20"/>
+          <w:sz w:val="2"/>
+          <w:szCs w:val="2"/>
+        </w:rPr>
+        <w:t xml:space="preserve">QZ9ZQ</w:t>
       </w:r>
     </w:p>
     <w:p>

</xml_diff>